<commit_message>
User Guide: remove NFC references and fix UI label wording
- Drop NFC Payment from receive methods, dashboard top-right icons, and
  Settings (NFC is not implemented in the app)
- Correct quoted UI labels: 'Logout' (was 'Log out') and
  'Don't have an account? Register' (was 'Do not...')
</commit_message>
<xml_diff>
--- a/PayRails_User_Guide.docx
+++ b/PayRails_User_Guide.docx
@@ -1567,7 +1567,7 @@
     </w:p>
     <w:p>
       <w:r>
-        <w:t>The bottom navigation bar has three tabs: Dashboard, Payments, and Settings. The top-right icons open Display QR (receive) and NFC Payment.</w:t>
+        <w:t>The bottom navigation bar has three tabs: Dashboard, Payments, and Settings. The top-right icon opens Display QR (receive).</w:t>
       </w:r>
     </w:p>
     <w:p>
@@ -1593,7 +1593,7 @@
     </w:p>
     <w:p>
       <w:r>
-        <w:t>Two ways to get paid:</w:t>
+        <w:t>To get paid:</w:t>
       </w:r>
     </w:p>
     <w:p>
@@ -1602,14 +1602,6 @@
       </w:pPr>
       <w:r>
         <w:t>Display QR to Receive Funds - tap the QR icon (top-right or the button). A QR code is shown; the payer scans it to send you money.</w:t>
-      </w:r>
-    </w:p>
-    <w:p>
-      <w:pPr>
-        <w:pStyle w:val="ListNumber"/>
-      </w:pPr>
-      <w:r>
-        <w:t>NFC Payment - tap the NFC icon to receive via a tap-to-pay device (where supported).</w:t>
       </w:r>
     </w:p>
     <w:p>
@@ -1897,7 +1889,7 @@
         <w:pStyle w:val="ListBullet"/>
       </w:pPr>
       <w:r>
-        <w:t>Open Bank Accounts, Display QR, or NFC Payment.</w:t>
+        <w:t>Open Bank Accounts or Display QR.</w:t>
       </w:r>
     </w:p>
     <w:p>
@@ -1905,7 +1897,7 @@
         <w:pStyle w:val="ListBullet"/>
       </w:pPr>
       <w:r>
-        <w:t>Log out (red button at the bottom).</w:t>
+        <w:t>Logout (red button at the bottom).</w:t>
       </w:r>
     </w:p>
     <w:p>
@@ -2169,7 +2161,7 @@
     </w:p>
     <w:p>
       <w:r>
-        <w:t>Same options as merchants: update Name, change Email, add a Mobile number for SMS alerts, open Bank Accounts, and Log out.</w:t>
+        <w:t>Same options as merchants: update Name, change Email, add a Mobile number for SMS alerts, open Bank Accounts, and Logout.</w:t>
       </w:r>
     </w:p>
     <w:p>
@@ -2265,7 +2257,7 @@
         <w:pStyle w:val="ListNumber"/>
       </w:pPr>
       <w:r>
-        <w:t>On the login screen tap "Do not have an account? Register".</w:t>
+        <w:t>On the login screen tap "Don't have an account? Register".</w:t>
       </w:r>
     </w:p>
     <w:p>

</xml_diff>

<commit_message>
User Guide: add Section 4.7 (Stablecoins) for consumer USDC/USD1 flows
Documents the in-app stablecoin wallet on the consumer Wallet tab: KYC gate,
per-asset balances, and Buy / Sell / Send (screened) / Receive (deposit QR),
plus a not-FDIC-insured note and an intro pointer.
</commit_message>
<xml_diff>
--- a/PayRails_User_Guide.docx
+++ b/PayRails_User_Guide.docx
@@ -44,6 +44,12 @@
       </w:r>
       <w:r>
         <w:t xml:space="preserve">. </w:t>
+      </w:r>
+    </w:p>
+    <w:p>
+      <w:pPr/>
+      <w:r>
+        <w:t>Consumers can also hold and move US-dollar stablecoins (USDC and USD1) directly from their wallet - see Section 4.7.</w:t>
       </w:r>
     </w:p>
     <w:p>
@@ -2179,6 +2185,100 @@
     </w:p>
     <w:p>
       <w:pPr>
+        <w:pStyle w:val="Heading2"/>
+      </w:pPr>
+      <w:r>
+        <w:t>4.7 Stablecoins (USDC &amp; USD1)</w:t>
+      </w:r>
+    </w:p>
+    <w:p>
+      <w:pPr/>
+      <w:r>
+        <w:t>On the Wallet tab, tap Stablecoins (USDC · USD1) to open your stablecoin wallet. Here you can hold and move two US-dollar stablecoins - USDC and USD1 - with balances shown per asset.</w:t>
+      </w:r>
+    </w:p>
+    <w:p>
+      <w:pPr/>
+      <w:r>
+        <w:t>Note: stablecoins are held with a regulated partner and are NOT FDIC-insured. This is a demo environment, so do not send real assets.</w:t>
+      </w:r>
+    </w:p>
+    <w:p>
+      <w:pPr/>
+      <w:r>
+        <w:t>The first time you open it, tap Verify identity (KYC) to complete identity verification, which is required before you can hold or move stablecoins. In the demo it is approved instantly, and the Buy, Sell, Send, and Receive actions unlock.</w:t>
+      </w:r>
+    </w:p>
+    <w:p>
+      <w:pPr/>
+      <w:r>
+        <w:t>What you can do:</w:t>
+      </w:r>
+    </w:p>
+    <w:p>
+      <w:pPr>
+        <w:pStyle w:val="ListBullet"/>
+      </w:pPr>
+      <w:r>
+        <w:t>Buy - convert US dollars from your wallet into a stablecoin. Choose the asset (USDC or USD1), enter a USD amount, and tap Buy.</w:t>
+      </w:r>
+    </w:p>
+    <w:p>
+      <w:pPr>
+        <w:pStyle w:val="ListBullet"/>
+      </w:pPr>
+      <w:r>
+        <w:t>Sell - convert a stablecoin back into US dollars in your wallet. Choose the asset, enter an amount, and tap Sell.</w:t>
+      </w:r>
+    </w:p>
+    <w:p>
+      <w:pPr>
+        <w:pStyle w:val="ListBullet"/>
+      </w:pPr>
+      <w:r>
+        <w:t>Send - send stablecoin on-chain to an external wallet address. Choose the asset, paste the destination address, enter an amount, and tap Send. The destination address is automatically screened; if it is flagged, the transfer is blocked and no funds move.</w:t>
+      </w:r>
+    </w:p>
+    <w:p>
+      <w:pPr>
+        <w:pStyle w:val="ListBullet"/>
+      </w:pPr>
+      <w:r>
+        <w:t>Receive - get a deposit address to receive stablecoin from an external wallet. Choose the asset and tap Get deposit address; a QR code and address are shown to copy or share.</w:t>
+      </w:r>
+    </w:p>
+    <w:p>
+      <w:pPr/>
+      <w:r>
+        <w:t>Your stablecoin buys, sells, sends, and deposits appear under Recent Activity in the stablecoin wallet.</w:t>
+      </w:r>
+    </w:p>
+    <w:p>
+      <w:pPr/>
+      <w:r>
+        <w:t xml:space="preserve">  [ SCREENSHOT: Consumer - Stablecoins wallet (balances, Buy / Sell / Send / Receive) ]  </w:t>
+      </w:r>
+    </w:p>
+    <w:p>
+      <w:pPr/>
+      <w:r>
+        <w:t xml:space="preserve">  [ SCREENSHOT: Consumer - Buy stablecoin (asset + USD amount) ]  </w:t>
+      </w:r>
+    </w:p>
+    <w:p>
+      <w:pPr/>
+      <w:r>
+        <w:t xml:space="preserve">  [ SCREENSHOT: Consumer - Send stablecoin (destination address + amount) ]  </w:t>
+      </w:r>
+    </w:p>
+    <w:p>
+      <w:pPr/>
+      <w:r>
+        <w:t xml:space="preserve">  [ SCREENSHOT: Consumer - Receive stablecoin (deposit address QR) ]  </w:t>
+      </w:r>
+    </w:p>
+    <w:p>
+      <w:pPr>
         <w:pStyle w:val="Heading1"/>
       </w:pPr>
       <w:r>

</xml_diff>